<commit_message>
Contracts: probation section follows the employee's probation
The template's Confirmation of Employment section is now conditional:
- on probation (probation end date set, review not done): a Probationary
  Period clause giving the length and end date;
- passed (review marked done): the original Confirmation of Employment
  wording;
- never on probation: the section is left out entirely, and the clauses
  after it renumber.
The profile's contract summary shows which applies.

Co-Authored-By: Claude Opus 5.5 <noreply@anthropic.com>
Claude-Session: https://claude.ai/code/session_013bXWJ1EZK4HsfzrgTMZCJH
</commit_message>
<xml_diff>
--- a/assets/employment-contract-template.docx
+++ b/assets/employment-contract-template.docx
@@ -228,6 +228,11 @@
       </w:r>
     </w:p>
     <w:p>
+      <w:r>
+        <w:t>{{#probation_section}}</w:t>
+      </w:r>
+    </w:p>
+    <w:p>
       <w:pPr>
         <w:pStyle w:val="Heading1"/>
         <w:spacing w:before="300" w:after="150"/>
@@ -240,7 +245,7 @@
           <w:sz w:val="28"/>
           <w:szCs w:val="28"/>
         </w:rPr>
-        <w:t>Confirmation of Employment</w:t>
+        <w:t xml:space="preserve">{{probation_heading}}</w:t>
       </w:r>
     </w:p>
     <w:p>
@@ -253,7 +258,12 @@
         <w:spacing w:after="120"/>
       </w:pPr>
       <w:r>
-        <w:t>You successfully completed your Probationary Period to our satisfaction, and we confirm your continued employment with us on a permanent basis.</w:t>
+        <w:t xml:space="preserve">{{probation_text}}</w:t>
+      </w:r>
+    </w:p>
+    <w:p>
+      <w:r>
+        <w:t>{{/probation_section}}</w:t>
       </w:r>
     </w:p>
     <w:p>

</xml_diff>